<commit_message>
Modifcaçoes no Panel de admin, adiçao de grids para visualizaçao de admin para ver clientes, criar alojamentos e ver os alojamentos que esta criados tal como eliminar
</commit_message>
<xml_diff>
--- a/Relatorio_POO_27998.docx
+++ b/Relatorio_POO_27998.docx
@@ -202,15 +202,7 @@
           <w:szCs w:val="38"/>
         </w:rPr>
         <w:tab/>
-        <w:t xml:space="preserve">Alexandre </w:t>
-      </w:r>
-      <w:proofErr w:type="spellStart"/>
-      <w:r>
-        <w:rPr>
-          <w:sz w:val="33"/>
-          <w:szCs w:val="38"/>
-        </w:rPr>
-        <w:t>Myk</w:t>
+        <w:t>Alexandre Myk</w:t>
       </w:r>
       <w:r>
         <w:rPr>
@@ -224,15 +216,7 @@
           <w:sz w:val="33"/>
           <w:szCs w:val="38"/>
         </w:rPr>
-        <w:t>ta</w:t>
-      </w:r>
-      <w:proofErr w:type="spellEnd"/>
-      <w:r>
-        <w:rPr>
-          <w:sz w:val="33"/>
-          <w:szCs w:val="38"/>
-        </w:rPr>
-        <w:t>, nº27998</w:t>
+        <w:t>ta, nº27998</w:t>
       </w:r>
     </w:p>
     <w:p/>
@@ -1237,10 +1221,7 @@
       </w:pPr>
       <w:bookmarkStart w:id="3" w:name="_Toc182314523"/>
       <w:r>
-        <w:t xml:space="preserve">Classe </w:t>
-      </w:r>
-      <w:r>
-        <w:t>Use</w:t>
+        <w:t>Classe Use</w:t>
       </w:r>
       <w:r>
         <w:t>rs</w:t>
@@ -1254,19 +1235,13 @@
         <w:jc w:val="both"/>
       </w:pPr>
       <w:r>
-        <w:t xml:space="preserve">A classe </w:t>
-      </w:r>
-      <w:r>
-        <w:t>Use</w:t>
+        <w:t>A classe Use</w:t>
       </w:r>
       <w:r>
         <w:t>rs</w:t>
       </w:r>
       <w:r>
-        <w:t xml:space="preserve"> representa os utilizadores do sistema, que podem ser administradores ou clientes. Esta classe armazena informações básicas, incluindo o nome de utilizador, a palavra-passe e o tipo de utilizador. O sistema utiliza esta classe para direcionar o utilizador para o painel adequado (administração ou cliente) após o login. O administrador pode ver e aprovar reservas, enquanto o cliente pode fazer novas reservas e visualizar informações sobre </w:t>
-      </w:r>
-      <w:r>
-        <w:t>os alojamentos</w:t>
+        <w:t xml:space="preserve"> representa os utilizadores do sistema, que podem ser administradores ou clientes. Esta classe armazena informações básicas, incluindo o nome de utilizador, a palavra-passe e o tipo de utilizador. O sistema utiliza esta classe para direcionar o utilizador para o painel adequado (administração ou cliente) após o login. O administrador pode ver e aprovar reservas, enquanto o cliente pode fazer novas reservas e visualizar informações sobre os alojamentos</w:t>
       </w:r>
       <w:r>
         <w:t>.</w:t>
@@ -1329,9 +1304,15 @@
         <w:rPr>
           <w:rStyle w:val="Ttulo3Carter"/>
         </w:rPr>
-        <w:t>Classe Client</w:t>
+        <w:t xml:space="preserve">Classe </w:t>
       </w:r>
       <w:bookmarkEnd w:id="6"/>
+      <w:r>
+        <w:rPr>
+          <w:rStyle w:val="Ttulo3Carter"/>
+        </w:rPr>
+        <w:t>ManagerUser</w:t>
+      </w:r>
       <w:r>
         <w:br/>
       </w:r>
@@ -1434,13 +1415,7 @@
         <w:t xml:space="preserve">             </w:t>
       </w:r>
       <w:r>
-        <w:t xml:space="preserve">A classe Registry serve para manter um histórico de ações e eventos relevantes no sistema, como registos de reservas e check-ins. Ela armazena todas as atividades e alterações </w:t>
-      </w:r>
-      <w:r>
-        <w:t>efetuadas</w:t>
-      </w:r>
-      <w:r>
-        <w:t xml:space="preserve"> no sistema, permitindo a consulta posterior, caso seja necessário. Esta funcionalidade é útil para fins de auditoria e para fornecer um histórico ao administrador</w:t>
+        <w:t>A classe Registry serve para manter um histórico de ações e eventos relevantes no sistema, como registos de reservas e check-ins. Ela armazena todas as atividades e alterações efetuadas no sistema, permitindo a consulta posterior, caso seja necessário. Esta funcionalidade é útil para fins de auditoria e para fornecer um histórico ao administrador</w:t>
       </w:r>
     </w:p>
     <w:p/>
@@ -2308,6 +2283,7 @@
   <w:style w:type="character" w:default="1" w:styleId="Tipodeletrapredefinidodopargrafo">
     <w:name w:val="Default Paragraph Font"/>
     <w:uiPriority w:val="1"/>
+    <w:semiHidden/>
     <w:unhideWhenUsed/>
   </w:style>
   <w:style w:type="table" w:default="1" w:styleId="Tabelanormal">

</xml_diff>